<commit_message>
Updated Assessment details formatting
</commit_message>
<xml_diff>
--- a/ALR-DocgenTemplates/Inspection_Worksheet_Template.docx
+++ b/ALR-DocgenTemplates/Inspection_Worksheet_Template.docx
@@ -1,6 +1,6 @@
 
 <file path=word/document.xml><?xml version="1.0" encoding="utf-8"?>
-<w:document xmlns:wpc="http://schemas.microsoft.com/office/word/2010/wordprocessingCanvas" xmlns:cx="http://schemas.microsoft.com/office/drawing/2014/chartex" xmlns:cx1="http://schemas.microsoft.com/office/drawing/2015/9/8/chartex" xmlns:cx2="http://schemas.microsoft.com/office/drawing/2015/10/21/chartex" xmlns:cx3="http://schemas.microsoft.com/office/drawing/2016/5/9/chartex" xmlns:cx4="http://schemas.microsoft.com/office/drawing/2016/5/10/chartex" xmlns:cx5="http://schemas.microsoft.com/office/drawing/2016/5/11/chartex" xmlns:cx6="http://schemas.microsoft.com/office/drawing/2016/5/12/chartex" xmlns:cx7="http://schemas.microsoft.com/office/drawing/2016/5/13/chartex" xmlns:cx8="http://schemas.microsoft.com/office/drawing/2016/5/14/chartex" xmlns:mc="http://schemas.openxmlformats.org/markup-compatibility/2006" xmlns:aink="http://schemas.microsoft.com/office/drawing/2016/ink" xmlns:am3d="http://schemas.microsoft.com/office/drawing/2017/model3d" xmlns:o="urn:schemas-microsoft-com:office:office" xmlns:oel="http://schemas.microsoft.com/office/2019/extlst" xmlns:r="http://schemas.openxmlformats.org/officeDocument/2006/relationships" xmlns:m="http://schemas.openxmlformats.org/officeDocument/2006/math" xmlns:v="urn:schemas-microsoft-com:vml" xmlns:wp14="http://schemas.microsoft.com/office/word/2010/wordprocessingDrawing" xmlns:wp="http://schemas.openxmlformats.org/drawingml/2006/wordprocessingDrawing" xmlns:w10="urn:schemas-microsoft-com:office:word" xmlns:w="http://schemas.openxmlformats.org/wordprocessingml/2006/main" xmlns:w14="http://schemas.microsoft.com/office/word/2010/wordml" xmlns:w15="http://schemas.microsoft.com/office/word/2012/wordml" xmlns:w16cex="http://schemas.microsoft.com/office/word/2018/wordml/cex" xmlns:w16cid="http://schemas.microsoft.com/office/word/2016/wordml/cid" xmlns:w16="http://schemas.microsoft.com/office/word/2018/wordml" xmlns:w16sdtdh="http://schemas.microsoft.com/office/word/2020/wordml/sdtdatahash" xmlns:w16se="http://schemas.microsoft.com/office/word/2015/wordml/symex" xmlns:wpg="http://schemas.microsoft.com/office/word/2010/wordprocessingGroup" xmlns:wpi="http://schemas.microsoft.com/office/word/2010/wordprocessingInk" xmlns:wne="http://schemas.microsoft.com/office/word/2006/wordml" xmlns:wps="http://schemas.microsoft.com/office/word/2010/wordprocessingShape" mc:Ignorable="w14 w15 w16se w16cid w16 w16cex w16sdtdh wp14">
+<w:document xmlns:wpc="http://schemas.microsoft.com/office/word/2010/wordprocessingCanvas" xmlns:cx="http://schemas.microsoft.com/office/drawing/2014/chartex" xmlns:cx1="http://schemas.microsoft.com/office/drawing/2015/9/8/chartex" xmlns:cx2="http://schemas.microsoft.com/office/drawing/2015/10/21/chartex" xmlns:cx3="http://schemas.microsoft.com/office/drawing/2016/5/9/chartex" xmlns:cx4="http://schemas.microsoft.com/office/drawing/2016/5/10/chartex" xmlns:cx5="http://schemas.microsoft.com/office/drawing/2016/5/11/chartex" xmlns:cx6="http://schemas.microsoft.com/office/drawing/2016/5/12/chartex" xmlns:cx7="http://schemas.microsoft.com/office/drawing/2016/5/13/chartex" xmlns:cx8="http://schemas.microsoft.com/office/drawing/2016/5/14/chartex" xmlns:mc="http://schemas.openxmlformats.org/markup-compatibility/2006" xmlns:aink="http://schemas.microsoft.com/office/drawing/2016/ink" xmlns:am3d="http://schemas.microsoft.com/office/drawing/2017/model3d" xmlns:o="urn:schemas-microsoft-com:office:office" xmlns:oel="http://schemas.microsoft.com/office/2019/extlst" xmlns:r="http://schemas.openxmlformats.org/officeDocument/2006/relationships" xmlns:m="http://schemas.openxmlformats.org/officeDocument/2006/math" xmlns:v="urn:schemas-microsoft-com:vml" xmlns:wp14="http://schemas.microsoft.com/office/word/2010/wordprocessingDrawing" xmlns:wp="http://schemas.openxmlformats.org/drawingml/2006/wordprocessingDrawing" xmlns:w10="urn:schemas-microsoft-com:office:word" xmlns:w="http://schemas.openxmlformats.org/wordprocessingml/2006/main" xmlns:w14="http://schemas.microsoft.com/office/word/2010/wordml" xmlns:w15="http://schemas.microsoft.com/office/word/2012/wordml" xmlns:w16cex="http://schemas.microsoft.com/office/word/2018/wordml/cex" xmlns:w16cid="http://schemas.microsoft.com/office/word/2016/wordml/cid" xmlns:w16="http://schemas.microsoft.com/office/word/2018/wordml" xmlns:w16du="http://schemas.microsoft.com/office/word/2023/wordml/word16du" xmlns:w16sdtdh="http://schemas.microsoft.com/office/word/2020/wordml/sdtdatahash" xmlns:w16sdtfl="http://schemas.microsoft.com/office/word/2024/wordml/sdtformatlock" xmlns:w16se="http://schemas.microsoft.com/office/word/2015/wordml/symex" xmlns:wpg="http://schemas.microsoft.com/office/word/2010/wordprocessingGroup" xmlns:wpi="http://schemas.microsoft.com/office/word/2010/wordprocessingInk" xmlns:wne="http://schemas.microsoft.com/office/word/2006/wordml" xmlns:wps="http://schemas.microsoft.com/office/word/2010/wordprocessingShape" mc:Ignorable="w14 w15 w16se w16cid w16 w16cex w16sdtdh w16sdtfl w16du wp14">
   <w:body>
     <w:p>
       <w:pPr>
@@ -36,7 +36,7 @@
                     <pic:cNvPicPr/>
                   </pic:nvPicPr>
                   <pic:blipFill>
-                    <a:blip r:embed="rId4" cstate="print">
+                    <a:blip r:embed="rId6" cstate="print">
                       <a:extLst>
                         <a:ext uri="{28A0092B-C50C-407E-A947-70E740481C1C}">
                           <a14:useLocalDpi xmlns:a14="http://schemas.microsoft.com/office/drawing/2010/main" val="0"/>
@@ -109,8 +109,8 @@
         <w:tblLook w:val="04A0" w:firstRow="1" w:lastRow="0" w:firstColumn="1" w:lastColumn="0" w:noHBand="0" w:noVBand="1"/>
       </w:tblPr>
       <w:tblGrid>
-        <w:gridCol w:w="7513"/>
-        <w:gridCol w:w="1837"/>
+        <w:gridCol w:w="7450"/>
+        <w:gridCol w:w="1820"/>
       </w:tblGrid>
       <w:tr>
         <w:tc>
@@ -153,6 +153,7 @@
               </w:rPr>
             </w:pPr>
             <w:bookmarkStart w:id="0" w:name="OLE_LINK1"/>
+            <w:proofErr w:type="gramStart"/>
             <w:r>
               <w:rPr>
                 <w:sz w:val="28"/>
@@ -167,6 +168,7 @@
               </w:rPr>
               <w:t>{{</w:t>
             </w:r>
+            <w:proofErr w:type="gramEnd"/>
             <w:r>
               <w:rPr>
                 <w:kern w:val="0"/>
@@ -192,6 +194,7 @@
                 <w:szCs w:val="28"/>
               </w:rPr>
             </w:pPr>
+            <w:proofErr w:type="gramStart"/>
             <w:r>
               <w:rPr>
                 <w:sz w:val="28"/>
@@ -209,6 +212,7 @@
               </w:rPr>
               <w:t>{{</w:t>
             </w:r>
+            <w:proofErr w:type="gramEnd"/>
             <w:r>
               <w:rPr>
                 <w:sz w:val="28"/>
@@ -238,6 +242,7 @@
                 <w:szCs w:val="28"/>
               </w:rPr>
             </w:pPr>
+            <w:proofErr w:type="gramStart"/>
             <w:r>
               <w:rPr>
                 <w:sz w:val="28"/>
@@ -252,6 +257,7 @@
               </w:rPr>
               <w:t>{{</w:t>
             </w:r>
+            <w:proofErr w:type="gramEnd"/>
             <w:r>
               <w:rPr>
                 <w:kern w:val="0"/>
@@ -278,6 +284,7 @@
                 <w:szCs w:val="32"/>
               </w:rPr>
             </w:pPr>
+            <w:proofErr w:type="gramStart"/>
             <w:r>
               <w:rPr>
                 <w:sz w:val="28"/>
@@ -290,7 +297,24 @@
                 <w:sz w:val="28"/>
                 <w:szCs w:val="28"/>
               </w:rPr>
-              <w:t>{{InsType}}</w:t>
+              <w:t>{{</w:t>
+            </w:r>
+            <w:proofErr w:type="spellStart"/>
+            <w:proofErr w:type="gramEnd"/>
+            <w:r>
+              <w:rPr>
+                <w:sz w:val="28"/>
+                <w:szCs w:val="28"/>
+              </w:rPr>
+              <w:t>InsType</w:t>
+            </w:r>
+            <w:proofErr w:type="spellEnd"/>
+            <w:r>
+              <w:rPr>
+                <w:sz w:val="28"/>
+                <w:szCs w:val="28"/>
+              </w:rPr>
+              <w:t>}}</w:t>
             </w:r>
           </w:p>
         </w:tc>
@@ -329,15 +353,15 @@
         <mc:AlternateContent>
           <mc:Choice Requires="wps">
             <w:drawing>
-              <wp:anchor distT="0" distB="0" distL="114300" distR="114300" simplePos="0" relativeHeight="251659264" behindDoc="0" locked="0" layoutInCell="1" allowOverlap="1" wp14:anchorId="52A7AB2D" wp14:editId="6DACAB96">
+              <wp:anchor distT="0" distB="0" distL="114300" distR="114300" simplePos="0" relativeHeight="251659264" behindDoc="0" locked="0" layoutInCell="1" allowOverlap="1" wp14:anchorId="52A7AB2D" wp14:editId="0F7BC2BC">
                 <wp:simplePos x="0" y="0"/>
                 <wp:positionH relativeFrom="column">
-                  <wp:posOffset>-57151</wp:posOffset>
+                  <wp:posOffset>-57150</wp:posOffset>
                 </wp:positionH>
                 <wp:positionV relativeFrom="paragraph">
                   <wp:posOffset>203200</wp:posOffset>
                 </wp:positionV>
-                <wp:extent cx="5819775" cy="0"/>
+                <wp:extent cx="5943600" cy="0"/>
                 <wp:effectExtent l="0" t="0" r="0" b="0"/>
                 <wp:wrapNone/>
                 <wp:docPr id="211902045" name="Straight Connector 1"/>
@@ -349,7 +373,7 @@
                       <wps:spPr>
                         <a:xfrm>
                           <a:off x="0" y="0"/>
-                          <a:ext cx="5819775" cy="0"/>
+                          <a:ext cx="5943600" cy="0"/>
                         </a:xfrm>
                         <a:prstGeom prst="line">
                           <a:avLst/>
@@ -373,12 +397,15 @@
                     </wps:wsp>
                   </a:graphicData>
                 </a:graphic>
+                <wp14:sizeRelH relativeFrom="margin">
+                  <wp14:pctWidth>0</wp14:pctWidth>
+                </wp14:sizeRelH>
               </wp:anchor>
             </w:drawing>
           </mc:Choice>
           <mc:Fallback>
             <w:pict>
-              <v:line w14:anchorId="291881E9" id="Straight Connector 1" o:spid="_x0000_s1026" style="position:absolute;z-index:251659264;visibility:visible;mso-wrap-style:square;mso-wrap-distance-left:9pt;mso-wrap-distance-top:0;mso-wrap-distance-right:9pt;mso-wrap-distance-bottom:0;mso-position-horizontal:absolute;mso-position-horizontal-relative:text;mso-position-vertical:absolute;mso-position-vertical-relative:text" from="-4.5pt,16pt" to="453.75pt,16pt" o:gfxdata="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" strokecolor="#4472c4 [3204]" strokeweight=".5pt">
+              <v:line w14:anchorId="0ABE7A05" id="Straight Connector 1" o:spid="_x0000_s1026" style="position:absolute;z-index:251659264;visibility:visible;mso-wrap-style:square;mso-width-percent:0;mso-wrap-distance-left:9pt;mso-wrap-distance-top:0;mso-wrap-distance-right:9pt;mso-wrap-distance-bottom:0;mso-position-horizontal:absolute;mso-position-horizontal-relative:text;mso-position-vertical:absolute;mso-position-vertical-relative:text;mso-width-percent:0;mso-width-relative:margin" from="-4.5pt,16pt" to="463.5pt,16pt" o:gfxdata="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" strokecolor="#4472c4 [3204]" strokeweight=".5pt">
                 <v:stroke joinstyle="miter"/>
               </v:line>
             </w:pict>
@@ -406,7 +433,7 @@
         <mc:AlternateContent>
           <mc:Choice Requires="wps">
             <w:drawing>
-              <wp:anchor distT="0" distB="0" distL="114300" distR="114300" simplePos="0" relativeHeight="251668480" behindDoc="0" locked="0" layoutInCell="1" allowOverlap="1" wp14:anchorId="577394BF" wp14:editId="081E38F5">
+              <wp:anchor distT="0" distB="0" distL="114300" distR="114300" simplePos="0" relativeHeight="251668480" behindDoc="0" locked="0" layoutInCell="1" allowOverlap="1" wp14:anchorId="577394BF" wp14:editId="756916D6">
                 <wp:simplePos x="0" y="0"/>
                 <wp:positionH relativeFrom="margin">
                   <wp:align>left</wp:align>
@@ -414,8 +441,8 @@
                 <wp:positionV relativeFrom="paragraph">
                   <wp:posOffset>229235</wp:posOffset>
                 </wp:positionV>
-                <wp:extent cx="5848350" cy="457200"/>
-                <wp:effectExtent l="0" t="0" r="19050" b="19050"/>
+                <wp:extent cx="5852160" cy="457200"/>
+                <wp:effectExtent l="0" t="0" r="15240" b="19050"/>
                 <wp:wrapNone/>
                 <wp:docPr id="1727186070" name="Rectangle 1"/>
                 <wp:cNvGraphicFramePr/>
@@ -426,7 +453,7 @@
                       <wps:spPr>
                         <a:xfrm>
                           <a:off x="0" y="0"/>
-                          <a:ext cx="5848350" cy="457200"/>
+                          <a:ext cx="5852160" cy="457200"/>
                         </a:xfrm>
                         <a:prstGeom prst="rect">
                           <a:avLst/>
@@ -471,7 +498,7 @@
           </mc:Choice>
           <mc:Fallback>
             <w:pict>
-              <v:rect w14:anchorId="577394BF" id="Rectangle 1" o:spid="_x0000_s1026" style="position:absolute;margin-left:0;margin-top:18.05pt;width:460.5pt;height:36pt;z-index:251668480;visibility:visible;mso-wrap-style:square;mso-width-percent:0;mso-height-percent:0;mso-wrap-distance-left:9pt;mso-wrap-distance-top:0;mso-wrap-distance-right:9pt;mso-wrap-distance-bottom:0;mso-position-horizontal:left;mso-position-horizontal-relative:margin;mso-position-vertical:absolute;mso-position-vertical-relative:text;mso-width-percent:0;mso-height-percent:0;mso-width-relative:margin;mso-height-relative:margin;v-text-anchor:middle" o:gfxdata="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" fillcolor="white [3201]" strokecolor="#4472c4 [3204]" strokeweight="1pt">
+              <v:rect w14:anchorId="577394BF" id="Rectangle 1" o:spid="_x0000_s1026" style="position:absolute;margin-left:0;margin-top:18.05pt;width:460.8pt;height:36pt;z-index:251668480;visibility:visible;mso-wrap-style:square;mso-width-percent:0;mso-height-percent:0;mso-wrap-distance-left:9pt;mso-wrap-distance-top:0;mso-wrap-distance-right:9pt;mso-wrap-distance-bottom:0;mso-position-horizontal:left;mso-position-horizontal-relative:margin;mso-position-vertical:absolute;mso-position-vertical-relative:text;mso-width-percent:0;mso-height-percent:0;mso-width-relative:margin;mso-height-relative:margin;v-text-anchor:middle" o:gfxdata="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" fillcolor="white [3201]" strokecolor="#4472c4 [3204]" strokeweight="1pt">
                 <v:textbox>
                   <w:txbxContent>
                     <w:p/>
@@ -515,14 +542,39 @@
     </w:p>
     <w:p>
       <w:pPr>
+        <w:keepNext/>
+        <w:spacing w:before="120" w:after="0"/>
         <w:rPr>
           <w:rStyle w:val="ui-provider"/>
+          <w:sz w:val="28"/>
+          <w:szCs w:val="28"/>
+        </w:rPr>
+      </w:pPr>
+      <w:r>
+        <w:rPr>
+          <w:kern w:val="0"/>
+          <w14:ligatures w14:val="none"/>
+        </w:rPr>
+        <w:t>{{#Q</w:t>
+      </w:r>
+      <w:proofErr w:type="gramStart"/>
+      <w:r>
+        <w:rPr>
+          <w:kern w:val="0"/>
+          <w14:ligatures w14:val="none"/>
+        </w:rPr>
+        <w:t>}}</w:t>
+      </w:r>
+      <w:r>
+        <w:rPr>
           <w:b/>
           <w:bCs/>
           <w:sz w:val="28"/>
           <w:szCs w:val="28"/>
         </w:rPr>
-      </w:pPr>
+        <w:t>Assessment</w:t>
+      </w:r>
+      <w:proofErr w:type="gramEnd"/>
       <w:r>
         <w:rPr>
           <w:b/>
@@ -530,48 +582,138 @@
           <w:sz w:val="28"/>
           <w:szCs w:val="28"/>
         </w:rPr>
-        <w:t>Assessment Details:</w:t>
+        <w:t xml:space="preserve"> Details:</w:t>
       </w:r>
+    </w:p>
+    <w:tbl>
+      <w:tblPr>
+        <w:tblStyle w:val="TableGrid"/>
+        <w:tblW w:w="0" w:type="auto"/>
+        <w:tblLook w:val="04A0" w:firstRow="1" w:lastRow="0" w:firstColumn="1" w:lastColumn="0" w:noHBand="0" w:noVBand="1"/>
+      </w:tblPr>
+      <w:tblGrid>
+        <w:gridCol w:w="9216"/>
+      </w:tblGrid>
+      <w:tr>
+        <w:tc>
+          <w:tcPr>
+            <w:tcW w:w="9216" w:type="dxa"/>
+            <w:tcBorders>
+              <w:top w:val="single" w:sz="8" w:space="0" w:color="4472C4" w:themeColor="accent1"/>
+              <w:left w:val="single" w:sz="8" w:space="0" w:color="4472C4" w:themeColor="accent1"/>
+              <w:bottom w:val="single" w:sz="8" w:space="0" w:color="4472C4" w:themeColor="accent1"/>
+              <w:right w:val="single" w:sz="8" w:space="0" w:color="4472C4" w:themeColor="accent1"/>
+            </w:tcBorders>
+            <w:tcMar>
+              <w:top w:w="72" w:type="dxa"/>
+              <w:left w:w="115" w:type="dxa"/>
+              <w:bottom w:w="72" w:type="dxa"/>
+              <w:right w:w="115" w:type="dxa"/>
+            </w:tcMar>
+          </w:tcPr>
+          <w:p>
+            <w:r>
+              <w:t>{{</w:t>
+            </w:r>
+            <w:proofErr w:type="spellStart"/>
+            <w:r>
+              <w:t>NewName</w:t>
+            </w:r>
+            <w:proofErr w:type="spellEnd"/>
+            <w:r>
+              <w:t>}}</w:t>
+            </w:r>
+          </w:p>
+        </w:tc>
+      </w:tr>
+    </w:tbl>
+    <w:p>
+      <w:pPr>
+        <w:keepNext/>
+        <w:spacing w:before="120" w:after="0"/>
+      </w:pPr>
       <w:r>
+        <w:t>Description:</w:t>
+      </w:r>
+    </w:p>
+    <w:tbl>
+      <w:tblPr>
+        <w:tblStyle w:val="TableGrid"/>
+        <w:tblW w:w="0" w:type="auto"/>
+        <w:tblCellMar>
+          <w:top w:w="288" w:type="dxa"/>
+          <w:bottom w:w="288" w:type="dxa"/>
+        </w:tblCellMar>
+        <w:tblLook w:val="04A0" w:firstRow="1" w:lastRow="0" w:firstColumn="1" w:lastColumn="0" w:noHBand="0" w:noVBand="1"/>
+      </w:tblPr>
+      <w:tblGrid>
+        <w:gridCol w:w="9250"/>
+      </w:tblGrid>
+      <w:tr>
+        <w:tc>
+          <w:tcPr>
+            <w:tcW w:w="9260" w:type="dxa"/>
+            <w:tcBorders>
+              <w:top w:val="single" w:sz="8" w:space="0" w:color="4472C4" w:themeColor="accent1"/>
+              <w:left w:val="single" w:sz="8" w:space="0" w:color="4472C4" w:themeColor="accent1"/>
+              <w:bottom w:val="single" w:sz="8" w:space="0" w:color="4472C4" w:themeColor="accent1"/>
+              <w:right w:val="single" w:sz="8" w:space="0" w:color="4472C4" w:themeColor="accent1"/>
+            </w:tcBorders>
+          </w:tcPr>
+          <w:p/>
+        </w:tc>
+      </w:tr>
+    </w:tbl>
+    <w:p>
+      <w:pPr>
         <w:rPr>
           <w:kern w:val="0"/>
           <w14:ligatures w14:val="none"/>
         </w:rPr>
-        <w:t>{{#Q}}</w:t>
+      </w:pPr>
+    </w:p>
+    <w:p>
+      <w:pPr>
+        <w:rPr>
+          <w:b/>
+          <w:bCs/>
+          <w:sz w:val="28"/>
+          <w:szCs w:val="28"/>
+        </w:rPr>
+      </w:pPr>
+      <w:r>
+        <w:rPr>
+          <w:kern w:val="0"/>
+          <w14:ligatures w14:val="none"/>
+        </w:rPr>
+        <w:t>{{/Q}}</w:t>
       </w:r>
     </w:p>
     <w:p>
-      <w:pPr>
-        <w:rPr>
-          <w:b/>
-          <w:bCs/>
-          <w:sz w:val="32"/>
-          <w:szCs w:val="32"/>
-        </w:rPr>
-      </w:pPr>
       <w:r>
         <w:rPr>
-          <w:b/>
-          <w:bCs/>
+          <w:rFonts w:ascii="Times New Roman" w:hAnsi="Times New Roman" w:cs="Times New Roman"/>
           <w:noProof/>
-          <w:sz w:val="32"/>
-          <w:szCs w:val="32"/>
+          <w:kern w:val="0"/>
+          <w:sz w:val="24"/>
+          <w:szCs w:val="24"/>
+          <w14:ligatures w14:val="none"/>
         </w:rPr>
         <mc:AlternateContent>
           <mc:Choice Requires="wps">
             <w:drawing>
-              <wp:anchor distT="0" distB="0" distL="114300" distR="114300" simplePos="0" relativeHeight="251660288" behindDoc="0" locked="0" layoutInCell="1" allowOverlap="1" wp14:anchorId="04AC2377" wp14:editId="10C2DED8">
+              <wp:anchor distT="0" distB="0" distL="114300" distR="114300" simplePos="0" relativeHeight="251670528" behindDoc="0" locked="0" layoutInCell="1" allowOverlap="1" wp14:anchorId="24A46947" wp14:editId="6EA68189">
                 <wp:simplePos x="0" y="0"/>
                 <wp:positionH relativeFrom="margin">
                   <wp:align>left</wp:align>
                 </wp:positionH>
                 <wp:positionV relativeFrom="paragraph">
-                  <wp:posOffset>21590</wp:posOffset>
+                  <wp:posOffset>285750</wp:posOffset>
                 </wp:positionV>
-                <wp:extent cx="5848350" cy="457200"/>
-                <wp:effectExtent l="0" t="0" r="19050" b="19050"/>
+                <wp:extent cx="5852160" cy="2400300"/>
+                <wp:effectExtent l="0" t="0" r="15240" b="19050"/>
                 <wp:wrapNone/>
-                <wp:docPr id="1808638041" name="Rectangle 2"/>
+                <wp:docPr id="2006771299" name="Rectangle 1"/>
                 <wp:cNvGraphicFramePr/>
                 <a:graphic xmlns:a="http://schemas.openxmlformats.org/drawingml/2006/main">
                   <a:graphicData uri="http://schemas.microsoft.com/office/word/2010/wordprocessingShape">
@@ -580,131 +722,7 @@
                       <wps:spPr>
                         <a:xfrm>
                           <a:off x="0" y="0"/>
-                          <a:ext cx="5848350" cy="457200"/>
-                        </a:xfrm>
-                        <a:prstGeom prst="rect">
-                          <a:avLst/>
-                        </a:prstGeom>
-                      </wps:spPr>
-                      <wps:style>
-                        <a:lnRef idx="2">
-                          <a:schemeClr val="accent1"/>
-                        </a:lnRef>
-                        <a:fillRef idx="1">
-                          <a:schemeClr val="lt1"/>
-                        </a:fillRef>
-                        <a:effectRef idx="0">
-                          <a:schemeClr val="accent1"/>
-                        </a:effectRef>
-                        <a:fontRef idx="minor">
-                          <a:schemeClr val="dk1"/>
-                        </a:fontRef>
-                      </wps:style>
-                      <wps:txbx>
-                        <w:txbxContent>
-                          <w:p>
-                            <w:r>
-                              <w:rPr>
-                                <w:kern w:val="0"/>
-                                <w14:ligatures w14:val="none"/>
-                              </w:rPr>
-                              <w:t>{{NewName}}</w:t>
-                            </w:r>
-                          </w:p>
-                        </w:txbxContent>
-                      </wps:txbx>
-                      <wps:bodyPr rot="0" spcFirstLastPara="0" vertOverflow="overflow" horzOverflow="overflow" vert="horz" wrap="square" lIns="91440" tIns="45720" rIns="91440" bIns="45720" numCol="1" spcCol="0" rtlCol="0" fromWordArt="0" anchor="ctr" anchorCtr="0" forceAA="0" compatLnSpc="1">
-                        <a:prstTxWarp prst="textNoShape">
-                          <a:avLst/>
-                        </a:prstTxWarp>
-                        <a:noAutofit/>
-                      </wps:bodyPr>
-                    </wps:wsp>
-                  </a:graphicData>
-                </a:graphic>
-                <wp14:sizeRelH relativeFrom="margin">
-                  <wp14:pctWidth>0</wp14:pctWidth>
-                </wp14:sizeRelH>
-                <wp14:sizeRelV relativeFrom="margin">
-                  <wp14:pctHeight>0</wp14:pctHeight>
-                </wp14:sizeRelV>
-              </wp:anchor>
-            </w:drawing>
-          </mc:Choice>
-          <mc:Fallback>
-            <w:pict>
-              <v:rect w14:anchorId="04AC2377" id="Rectangle 2" o:spid="_x0000_s1027" style="position:absolute;margin-left:0;margin-top:1.7pt;width:460.5pt;height:36pt;z-index:251660288;visibility:visible;mso-wrap-style:square;mso-width-percent:0;mso-height-percent:0;mso-wrap-distance-left:9pt;mso-wrap-distance-top:0;mso-wrap-distance-right:9pt;mso-wrap-distance-bottom:0;mso-position-horizontal:left;mso-position-horizontal-relative:margin;mso-position-vertical:absolute;mso-position-vertical-relative:text;mso-width-percent:0;mso-height-percent:0;mso-width-relative:margin;mso-height-relative:margin;v-text-anchor:middle" o:gfxdata="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" fillcolor="white [3201]" strokecolor="#4472c4 [3204]" strokeweight="1pt">
-                <v:textbox>
-                  <w:txbxContent>
-                    <w:p>
-                      <w:r>
-                        <w:rPr>
-                          <w:kern w:val="0"/>
-                          <w14:ligatures w14:val="none"/>
-                        </w:rPr>
-                        <w:t>{{</w:t>
-                      </w:r>
-                      <w:proofErr w:type="spellStart"/>
-                      <w:r>
-                        <w:rPr>
-                          <w:kern w:val="0"/>
-                          <w14:ligatures w14:val="none"/>
-                        </w:rPr>
-                        <w:t>NewName</w:t>
-                      </w:r>
-                      <w:proofErr w:type="spellEnd"/>
-                      <w:r>
-                        <w:rPr>
-                          <w:kern w:val="0"/>
-                          <w14:ligatures w14:val="none"/>
-                        </w:rPr>
-                        <w:t>}}</w:t>
-                      </w:r>
-                    </w:p>
-                  </w:txbxContent>
-                </v:textbox>
-                <w10:wrap anchorx="margin"/>
-              </v:rect>
-            </w:pict>
-          </mc:Fallback>
-        </mc:AlternateContent>
-      </w:r>
-    </w:p>
-    <w:p/>
-    <w:p>
-      <w:r>
-        <w:rPr>
-          <w:rFonts w:ascii="Times New Roman" w:hAnsi="Times New Roman" w:cs="Times New Roman"/>
-          <w:noProof/>
-          <w:kern w:val="0"/>
-          <w:sz w:val="24"/>
-          <w:szCs w:val="24"/>
-          <w14:ligatures w14:val="none"/>
-        </w:rPr>
-        <mc:AlternateContent>
-          <mc:Choice Requires="wps">
-            <w:drawing>
-              <wp:anchor distT="0" distB="0" distL="114300" distR="114300" simplePos="0" relativeHeight="251662336" behindDoc="0" locked="0" layoutInCell="1" allowOverlap="1" wp14:anchorId="52B34C5F" wp14:editId="5A06F7DD">
-                <wp:simplePos x="0" y="0"/>
-                <wp:positionH relativeFrom="margin">
-                  <wp:align>left</wp:align>
-                </wp:positionH>
-                <wp:positionV relativeFrom="paragraph">
-                  <wp:posOffset>228600</wp:posOffset>
-                </wp:positionV>
-                <wp:extent cx="5848350" cy="457200"/>
-                <wp:effectExtent l="0" t="0" r="19050" b="19050"/>
-                <wp:wrapNone/>
-                <wp:docPr id="1619704315" name="Rectangle 3"/>
-                <wp:cNvGraphicFramePr/>
-                <a:graphic xmlns:a="http://schemas.openxmlformats.org/drawingml/2006/main">
-                  <a:graphicData uri="http://schemas.microsoft.com/office/word/2010/wordprocessingShape">
-                    <wps:wsp>
-                      <wps:cNvSpPr/>
-                      <wps:spPr>
-                        <a:xfrm>
-                          <a:off x="0" y="0"/>
-                          <a:ext cx="5848350" cy="457200"/>
+                          <a:ext cx="5852160" cy="2400300"/>
                         </a:xfrm>
                         <a:prstGeom prst="rect">
                           <a:avLst/>
@@ -749,119 +767,7 @@
           </mc:Choice>
           <mc:Fallback>
             <w:pict>
-              <v:rect w14:anchorId="52B34C5F" id="Rectangle 3" o:spid="_x0000_s1028" style="position:absolute;margin-left:0;margin-top:18pt;width:460.5pt;height:36pt;z-index:251662336;visibility:visible;mso-wrap-style:square;mso-width-percent:0;mso-height-percent:0;mso-wrap-distance-left:9pt;mso-wrap-distance-top:0;mso-wrap-distance-right:9pt;mso-wrap-distance-bottom:0;mso-position-horizontal:left;mso-position-horizontal-relative:margin;mso-position-vertical:absolute;mso-position-vertical-relative:text;mso-width-percent:0;mso-height-percent:0;mso-width-relative:margin;mso-height-relative:margin;v-text-anchor:middle" o:gfxdata="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" fillcolor="white [3201]" strokecolor="#4472c4 [3204]" strokeweight="1pt">
-                <v:textbox>
-                  <w:txbxContent>
-                    <w:p/>
-                  </w:txbxContent>
-                </v:textbox>
-                <w10:wrap anchorx="margin"/>
-              </v:rect>
-            </w:pict>
-          </mc:Fallback>
-        </mc:AlternateContent>
-      </w:r>
-      <w:r>
-        <w:t>Description:</w:t>
-      </w:r>
-    </w:p>
-    <w:p/>
-    <w:p>
-      <w:pPr>
-        <w:rPr>
-          <w:b/>
-          <w:bCs/>
-          <w:sz w:val="28"/>
-          <w:szCs w:val="28"/>
-        </w:rPr>
-      </w:pPr>
-      <w:r>
-        <w:rPr>
-          <w:kern w:val="0"/>
-          <w14:ligatures w14:val="none"/>
-        </w:rPr>
-        <w:t>{{/Q}}</w:t>
-      </w:r>
-    </w:p>
-    <w:p>
-      <w:r>
-        <w:rPr>
-          <w:rFonts w:ascii="Times New Roman" w:hAnsi="Times New Roman" w:cs="Times New Roman"/>
-          <w:noProof/>
-          <w:kern w:val="0"/>
-          <w:sz w:val="24"/>
-          <w:szCs w:val="24"/>
-          <w14:ligatures w14:val="none"/>
-        </w:rPr>
-        <mc:AlternateContent>
-          <mc:Choice Requires="wps">
-            <w:drawing>
-              <wp:anchor distT="0" distB="0" distL="114300" distR="114300" simplePos="0" relativeHeight="251670528" behindDoc="0" locked="0" layoutInCell="1" allowOverlap="1" wp14:anchorId="24A46947" wp14:editId="49CB93DC">
-                <wp:simplePos x="0" y="0"/>
-                <wp:positionH relativeFrom="margin">
-                  <wp:align>left</wp:align>
-                </wp:positionH>
-                <wp:positionV relativeFrom="paragraph">
-                  <wp:posOffset>285750</wp:posOffset>
-                </wp:positionV>
-                <wp:extent cx="5988050" cy="2400300"/>
-                <wp:effectExtent l="0" t="0" r="12700" b="19050"/>
-                <wp:wrapNone/>
-                <wp:docPr id="2006771299" name="Rectangle 1"/>
-                <wp:cNvGraphicFramePr/>
-                <a:graphic xmlns:a="http://schemas.openxmlformats.org/drawingml/2006/main">
-                  <a:graphicData uri="http://schemas.microsoft.com/office/word/2010/wordprocessingShape">
-                    <wps:wsp>
-                      <wps:cNvSpPr/>
-                      <wps:spPr>
-                        <a:xfrm>
-                          <a:off x="0" y="0"/>
-                          <a:ext cx="5988050" cy="2400300"/>
-                        </a:xfrm>
-                        <a:prstGeom prst="rect">
-                          <a:avLst/>
-                        </a:prstGeom>
-                      </wps:spPr>
-                      <wps:style>
-                        <a:lnRef idx="2">
-                          <a:schemeClr val="accent1"/>
-                        </a:lnRef>
-                        <a:fillRef idx="1">
-                          <a:schemeClr val="lt1"/>
-                        </a:fillRef>
-                        <a:effectRef idx="0">
-                          <a:schemeClr val="accent1"/>
-                        </a:effectRef>
-                        <a:fontRef idx="minor">
-                          <a:schemeClr val="dk1"/>
-                        </a:fontRef>
-                      </wps:style>
-                      <wps:txbx>
-                        <w:txbxContent>
-                          <w:p/>
-                        </w:txbxContent>
-                      </wps:txbx>
-                      <wps:bodyPr rot="0" spcFirstLastPara="0" vertOverflow="clip" horzOverflow="clip" vert="horz" wrap="square" lIns="91440" tIns="45720" rIns="91440" bIns="45720" numCol="1" spcCol="0" rtlCol="0" fromWordArt="0" anchor="ctr" anchorCtr="0" forceAA="0" compatLnSpc="1">
-                        <a:prstTxWarp prst="textNoShape">
-                          <a:avLst/>
-                        </a:prstTxWarp>
-                        <a:noAutofit/>
-                      </wps:bodyPr>
-                    </wps:wsp>
-                  </a:graphicData>
-                </a:graphic>
-                <wp14:sizeRelH relativeFrom="margin">
-                  <wp14:pctWidth>0</wp14:pctWidth>
-                </wp14:sizeRelH>
-                <wp14:sizeRelV relativeFrom="margin">
-                  <wp14:pctHeight>0</wp14:pctHeight>
-                </wp14:sizeRelV>
-              </wp:anchor>
-            </w:drawing>
-          </mc:Choice>
-          <mc:Fallback>
-            <w:pict>
-              <v:rect w14:anchorId="24A46947" id="_x0000_s1031" style="position:absolute;margin-left:0;margin-top:22.5pt;width:471.5pt;height:189pt;z-index:251670528;visibility:visible;mso-wrap-style:square;mso-width-percent:0;mso-height-percent:0;mso-wrap-distance-left:9pt;mso-wrap-distance-top:0;mso-wrap-distance-right:9pt;mso-wrap-distance-bottom:0;mso-position-horizontal:left;mso-position-horizontal-relative:margin;mso-position-vertical:absolute;mso-position-vertical-relative:text;mso-width-percent:0;mso-height-percent:0;mso-width-relative:margin;mso-height-relative:margin;v-text-anchor:middle" o:gfxdata="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" fillcolor="white [3201]" strokecolor="#4472c4 [3204]" strokeweight="1pt">
+              <v:rect w14:anchorId="24A46947" id="_x0000_s1027" style="position:absolute;margin-left:0;margin-top:22.5pt;width:460.8pt;height:189pt;z-index:251670528;visibility:visible;mso-wrap-style:square;mso-width-percent:0;mso-height-percent:0;mso-wrap-distance-left:9pt;mso-wrap-distance-top:0;mso-wrap-distance-right:9pt;mso-wrap-distance-bottom:0;mso-position-horizontal:left;mso-position-horizontal-relative:margin;mso-position-vertical:absolute;mso-position-vertical-relative:text;mso-width-percent:0;mso-height-percent:0;mso-width-relative:margin;mso-height-relative:margin;v-text-anchor:middle" o:gfxdata="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" fillcolor="white [3201]" strokecolor="#4472c4 [3204]" strokeweight="1pt">
                 <v:textbox>
                   <w:txbxContent>
                     <w:p/>
@@ -902,8 +808,11 @@
       </w:pPr>
     </w:p>
     <w:sectPr>
+      <w:footerReference w:type="even" r:id="rId7"/>
+      <w:footerReference w:type="default" r:id="rId8"/>
+      <w:footerReference w:type="first" r:id="rId9"/>
       <w:pgSz w:w="12240" w:h="15840"/>
-      <w:pgMar w:top="1440" w:right="1440" w:bottom="1440" w:left="1440" w:header="708" w:footer="708" w:gutter="0"/>
+      <w:pgMar w:top="1440" w:right="1530" w:bottom="1440" w:left="1440" w:header="708" w:footer="708" w:gutter="0"/>
       <w:cols w:space="708"/>
       <w:docGrid w:linePitch="360"/>
     </w:sectPr>
@@ -911,8 +820,469 @@
 </w:document>
 </file>
 
+<file path=word/endnotes.xml><?xml version="1.0" encoding="utf-8"?>
+<w:endnotes xmlns:wpc="http://schemas.microsoft.com/office/word/2010/wordprocessingCanvas" xmlns:cx="http://schemas.microsoft.com/office/drawing/2014/chartex" xmlns:cx1="http://schemas.microsoft.com/office/drawing/2015/9/8/chartex" xmlns:cx2="http://schemas.microsoft.com/office/drawing/2015/10/21/chartex" xmlns:cx3="http://schemas.microsoft.com/office/drawing/2016/5/9/chartex" xmlns:cx4="http://schemas.microsoft.com/office/drawing/2016/5/10/chartex" xmlns:cx5="http://schemas.microsoft.com/office/drawing/2016/5/11/chartex" xmlns:cx6="http://schemas.microsoft.com/office/drawing/2016/5/12/chartex" xmlns:cx7="http://schemas.microsoft.com/office/drawing/2016/5/13/chartex" xmlns:cx8="http://schemas.microsoft.com/office/drawing/2016/5/14/chartex" xmlns:mc="http://schemas.openxmlformats.org/markup-compatibility/2006" xmlns:aink="http://schemas.microsoft.com/office/drawing/2016/ink" xmlns:am3d="http://schemas.microsoft.com/office/drawing/2017/model3d" xmlns:o="urn:schemas-microsoft-com:office:office" xmlns:oel="http://schemas.microsoft.com/office/2019/extlst" xmlns:r="http://schemas.openxmlformats.org/officeDocument/2006/relationships" xmlns:m="http://schemas.openxmlformats.org/officeDocument/2006/math" xmlns:v="urn:schemas-microsoft-com:vml" xmlns:wp14="http://schemas.microsoft.com/office/word/2010/wordprocessingDrawing" xmlns:wp="http://schemas.openxmlformats.org/drawingml/2006/wordprocessingDrawing" xmlns:w10="urn:schemas-microsoft-com:office:word" xmlns:w="http://schemas.openxmlformats.org/wordprocessingml/2006/main" xmlns:w14="http://schemas.microsoft.com/office/word/2010/wordml" xmlns:w15="http://schemas.microsoft.com/office/word/2012/wordml" xmlns:w16cex="http://schemas.microsoft.com/office/word/2018/wordml/cex" xmlns:w16cid="http://schemas.microsoft.com/office/word/2016/wordml/cid" xmlns:w16="http://schemas.microsoft.com/office/word/2018/wordml" xmlns:w16du="http://schemas.microsoft.com/office/word/2023/wordml/word16du" xmlns:w16sdtdh="http://schemas.microsoft.com/office/word/2020/wordml/sdtdatahash" xmlns:w16sdtfl="http://schemas.microsoft.com/office/word/2024/wordml/sdtformatlock" xmlns:w16se="http://schemas.microsoft.com/office/word/2015/wordml/symex" xmlns:wpg="http://schemas.microsoft.com/office/word/2010/wordprocessingGroup" xmlns:wpi="http://schemas.microsoft.com/office/word/2010/wordprocessingInk" xmlns:wne="http://schemas.microsoft.com/office/word/2006/wordml" xmlns:wps="http://schemas.microsoft.com/office/word/2010/wordprocessingShape" mc:Ignorable="w14 w15 w16se w16cid w16 w16cex w16sdtdh w16sdtfl w16du wp14">
+  <w:endnote w:type="separator" w:id="-1">
+    <w:p>
+      <w:pPr>
+        <w:spacing w:after="0" w:line="240" w:lineRule="auto"/>
+      </w:pPr>
+      <w:r>
+        <w:separator/>
+      </w:r>
+    </w:p>
+  </w:endnote>
+  <w:endnote w:type="continuationSeparator" w:id="0">
+    <w:p>
+      <w:pPr>
+        <w:spacing w:after="0" w:line="240" w:lineRule="auto"/>
+      </w:pPr>
+      <w:r>
+        <w:continuationSeparator/>
+      </w:r>
+    </w:p>
+  </w:endnote>
+</w:endnotes>
+</file>
+
+<file path=word/footer1.xml><?xml version="1.0" encoding="utf-8"?>
+<w:ftr xmlns:wpc="http://schemas.microsoft.com/office/word/2010/wordprocessingCanvas" xmlns:cx="http://schemas.microsoft.com/office/drawing/2014/chartex" xmlns:cx1="http://schemas.microsoft.com/office/drawing/2015/9/8/chartex" xmlns:cx2="http://schemas.microsoft.com/office/drawing/2015/10/21/chartex" xmlns:cx3="http://schemas.microsoft.com/office/drawing/2016/5/9/chartex" xmlns:cx4="http://schemas.microsoft.com/office/drawing/2016/5/10/chartex" xmlns:cx5="http://schemas.microsoft.com/office/drawing/2016/5/11/chartex" xmlns:cx6="http://schemas.microsoft.com/office/drawing/2016/5/12/chartex" xmlns:cx7="http://schemas.microsoft.com/office/drawing/2016/5/13/chartex" xmlns:cx8="http://schemas.microsoft.com/office/drawing/2016/5/14/chartex" xmlns:mc="http://schemas.openxmlformats.org/markup-compatibility/2006" xmlns:aink="http://schemas.microsoft.com/office/drawing/2016/ink" xmlns:am3d="http://schemas.microsoft.com/office/drawing/2017/model3d" xmlns:o="urn:schemas-microsoft-com:office:office" xmlns:oel="http://schemas.microsoft.com/office/2019/extlst" xmlns:r="http://schemas.openxmlformats.org/officeDocument/2006/relationships" xmlns:m="http://schemas.openxmlformats.org/officeDocument/2006/math" xmlns:v="urn:schemas-microsoft-com:vml" xmlns:wp14="http://schemas.microsoft.com/office/word/2010/wordprocessingDrawing" xmlns:wp="http://schemas.openxmlformats.org/drawingml/2006/wordprocessingDrawing" xmlns:w10="urn:schemas-microsoft-com:office:word" xmlns:w="http://schemas.openxmlformats.org/wordprocessingml/2006/main" xmlns:w14="http://schemas.microsoft.com/office/word/2010/wordml" xmlns:w15="http://schemas.microsoft.com/office/word/2012/wordml" xmlns:w16cex="http://schemas.microsoft.com/office/word/2018/wordml/cex" xmlns:w16cid="http://schemas.microsoft.com/office/word/2016/wordml/cid" xmlns:w16="http://schemas.microsoft.com/office/word/2018/wordml" xmlns:w16du="http://schemas.microsoft.com/office/word/2023/wordml/word16du" xmlns:w16sdtdh="http://schemas.microsoft.com/office/word/2020/wordml/sdtdatahash" xmlns:w16sdtfl="http://schemas.microsoft.com/office/word/2024/wordml/sdtformatlock" xmlns:w16se="http://schemas.microsoft.com/office/word/2015/wordml/symex" xmlns:wpg="http://schemas.microsoft.com/office/word/2010/wordprocessingGroup" xmlns:wpi="http://schemas.microsoft.com/office/word/2010/wordprocessingInk" xmlns:wne="http://schemas.microsoft.com/office/word/2006/wordml" xmlns:wps="http://schemas.microsoft.com/office/word/2010/wordprocessingShape" mc:Ignorable="w14 w15 w16se w16cid w16 w16cex w16sdtdh w16sdtfl w16du wp14">
+  <w:p>
+    <w:pPr>
+      <w:pStyle w:val="Footer"/>
+    </w:pPr>
+    <w:r>
+      <w:rPr>
+        <w:noProof/>
+      </w:rPr>
+      <mc:AlternateContent>
+        <mc:Choice Requires="wps">
+          <w:drawing>
+            <wp:anchor distT="0" distB="0" distL="0" distR="0" simplePos="0" relativeHeight="251659264" behindDoc="0" locked="0" layoutInCell="1" allowOverlap="1" wp14:anchorId="654089B0" wp14:editId="4BD2E6EC">
+              <wp:simplePos x="635" y="635"/>
+              <wp:positionH relativeFrom="page">
+                <wp:align>center</wp:align>
+              </wp:positionH>
+              <wp:positionV relativeFrom="page">
+                <wp:align>bottom</wp:align>
+              </wp:positionV>
+              <wp:extent cx="381635" cy="497205"/>
+              <wp:effectExtent l="0" t="0" r="18415" b="0"/>
+              <wp:wrapNone/>
+              <wp:docPr id="1848056641" name="Text Box 7" descr="Internal">
+                <a:extLst xmlns:a="http://schemas.openxmlformats.org/drawingml/2006/main">
+                  <a:ext uri="{5AE41FA2-C0FF-4470-9BD4-5FADCA87CBE2}">
+                    <aclsh:classification xmlns:aclsh="http://schemas.microsoft.com/office/drawing/2020/classificationShape" classificationOutcomeType="ftr"/>
+                  </a:ext>
+                </a:extLst>
+              </wp:docPr>
+              <wp:cNvGraphicFramePr/>
+              <a:graphic xmlns:a="http://schemas.openxmlformats.org/drawingml/2006/main">
+                <a:graphicData uri="http://schemas.microsoft.com/office/word/2010/wordprocessingShape">
+                  <wps:wsp>
+                    <wps:cNvSpPr txBox="1"/>
+                    <wps:spPr>
+                      <a:xfrm>
+                        <a:off x="0" y="0"/>
+                        <a:ext cx="381635" cy="497205"/>
+                      </a:xfrm>
+                      <a:prstGeom prst="rect">
+                        <a:avLst/>
+                      </a:prstGeom>
+                      <a:noFill/>
+                      <a:ln>
+                        <a:noFill/>
+                      </a:ln>
+                    </wps:spPr>
+                    <wps:txbx>
+                      <w:txbxContent>
+                        <w:p>
+                          <w:pPr>
+                            <w:spacing w:after="0"/>
+                            <w:rPr>
+                              <w:rFonts w:ascii="Arial" w:eastAsia="Arial" w:hAnsi="Arial" w:cs="Arial"/>
+                              <w:noProof/>
+                              <w:color w:val="000000"/>
+                              <w:sz w:val="18"/>
+                              <w:szCs w:val="18"/>
+                            </w:rPr>
+                          </w:pPr>
+                          <w:r>
+                            <w:rPr>
+                              <w:rFonts w:ascii="Arial" w:eastAsia="Arial" w:hAnsi="Arial" w:cs="Arial"/>
+                              <w:noProof/>
+                              <w:color w:val="000000"/>
+                              <w:sz w:val="18"/>
+                              <w:szCs w:val="18"/>
+                            </w:rPr>
+                            <w:t>Internal</w:t>
+                          </w:r>
+                        </w:p>
+                      </w:txbxContent>
+                    </wps:txbx>
+                    <wps:bodyPr rot="0" spcFirstLastPara="0" vertOverflow="overflow" horzOverflow="overflow" vert="horz" wrap="none" lIns="0" tIns="0" rIns="0" bIns="355600" numCol="1" spcCol="0" rtlCol="0" fromWordArt="0" anchor="b" anchorCtr="0" forceAA="0" compatLnSpc="1">
+                      <a:prstTxWarp prst="textNoShape">
+                        <a:avLst/>
+                      </a:prstTxWarp>
+                      <a:spAutoFit/>
+                    </wps:bodyPr>
+                  </wps:wsp>
+                </a:graphicData>
+              </a:graphic>
+              <wp14:sizeRelH relativeFrom="margin">
+                <wp14:pctWidth>0</wp14:pctWidth>
+              </wp14:sizeRelH>
+              <wp14:sizeRelV relativeFrom="margin">
+                <wp14:pctHeight>0</wp14:pctHeight>
+              </wp14:sizeRelV>
+            </wp:anchor>
+          </w:drawing>
+        </mc:Choice>
+        <mc:Fallback>
+          <w:pict>
+            <v:shapetype w14:anchorId="654089B0" id="_x0000_t202" coordsize="21600,21600" o:spt="202" path="m,l,21600r21600,l21600,xe">
+              <v:stroke joinstyle="miter"/>
+              <v:path gradientshapeok="t" o:connecttype="rect"/>
+            </v:shapetype>
+            <v:shape id="Text Box 7" o:spid="_x0000_s1028" type="#_x0000_t202" alt="Internal" style="position:absolute;margin-left:0;margin-top:0;width:30.05pt;height:39.15pt;z-index:251659264;visibility:visible;mso-wrap-style:none;mso-width-percent:0;mso-height-percent:0;mso-wrap-distance-left:0;mso-wrap-distance-top:0;mso-wrap-distance-right:0;mso-wrap-distance-bottom:0;mso-position-horizontal:center;mso-position-horizontal-relative:page;mso-position-vertical:bottom;mso-position-vertical-relative:page;mso-width-percent:0;mso-height-percent:0;mso-width-relative:margin;mso-height-relative:margin;v-text-anchor:bottom" o:gfxdata="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" filled="f" stroked="f">
+              <v:fill o:detectmouseclick="t"/>
+              <v:textbox style="mso-fit-shape-to-text:t" inset="0,0,0,28pt">
+                <w:txbxContent>
+                  <w:p>
+                    <w:pPr>
+                      <w:spacing w:after="0"/>
+                      <w:rPr>
+                        <w:rFonts w:ascii="Arial" w:eastAsia="Arial" w:hAnsi="Arial" w:cs="Arial"/>
+                        <w:noProof/>
+                        <w:color w:val="000000"/>
+                        <w:sz w:val="18"/>
+                        <w:szCs w:val="18"/>
+                      </w:rPr>
+                    </w:pPr>
+                    <w:r>
+                      <w:rPr>
+                        <w:rFonts w:ascii="Arial" w:eastAsia="Arial" w:hAnsi="Arial" w:cs="Arial"/>
+                        <w:noProof/>
+                        <w:color w:val="000000"/>
+                        <w:sz w:val="18"/>
+                        <w:szCs w:val="18"/>
+                      </w:rPr>
+                      <w:t>Internal</w:t>
+                    </w:r>
+                  </w:p>
+                </w:txbxContent>
+              </v:textbox>
+              <w10:wrap anchorx="page" anchory="page"/>
+            </v:shape>
+          </w:pict>
+        </mc:Fallback>
+      </mc:AlternateContent>
+    </w:r>
+  </w:p>
+</w:ftr>
+</file>
+
+<file path=word/footer2.xml><?xml version="1.0" encoding="utf-8"?>
+<w:ftr xmlns:wpc="http://schemas.microsoft.com/office/word/2010/wordprocessingCanvas" xmlns:cx="http://schemas.microsoft.com/office/drawing/2014/chartex" xmlns:cx1="http://schemas.microsoft.com/office/drawing/2015/9/8/chartex" xmlns:cx2="http://schemas.microsoft.com/office/drawing/2015/10/21/chartex" xmlns:cx3="http://schemas.microsoft.com/office/drawing/2016/5/9/chartex" xmlns:cx4="http://schemas.microsoft.com/office/drawing/2016/5/10/chartex" xmlns:cx5="http://schemas.microsoft.com/office/drawing/2016/5/11/chartex" xmlns:cx6="http://schemas.microsoft.com/office/drawing/2016/5/12/chartex" xmlns:cx7="http://schemas.microsoft.com/office/drawing/2016/5/13/chartex" xmlns:cx8="http://schemas.microsoft.com/office/drawing/2016/5/14/chartex" xmlns:mc="http://schemas.openxmlformats.org/markup-compatibility/2006" xmlns:aink="http://schemas.microsoft.com/office/drawing/2016/ink" xmlns:am3d="http://schemas.microsoft.com/office/drawing/2017/model3d" xmlns:o="urn:schemas-microsoft-com:office:office" xmlns:oel="http://schemas.microsoft.com/office/2019/extlst" xmlns:r="http://schemas.openxmlformats.org/officeDocument/2006/relationships" xmlns:m="http://schemas.openxmlformats.org/officeDocument/2006/math" xmlns:v="urn:schemas-microsoft-com:vml" xmlns:wp14="http://schemas.microsoft.com/office/word/2010/wordprocessingDrawing" xmlns:wp="http://schemas.openxmlformats.org/drawingml/2006/wordprocessingDrawing" xmlns:w10="urn:schemas-microsoft-com:office:word" xmlns:w="http://schemas.openxmlformats.org/wordprocessingml/2006/main" xmlns:w14="http://schemas.microsoft.com/office/word/2010/wordml" xmlns:w15="http://schemas.microsoft.com/office/word/2012/wordml" xmlns:w16cex="http://schemas.microsoft.com/office/word/2018/wordml/cex" xmlns:w16cid="http://schemas.microsoft.com/office/word/2016/wordml/cid" xmlns:w16="http://schemas.microsoft.com/office/word/2018/wordml" xmlns:w16du="http://schemas.microsoft.com/office/word/2023/wordml/word16du" xmlns:w16sdtdh="http://schemas.microsoft.com/office/word/2020/wordml/sdtdatahash" xmlns:w16sdtfl="http://schemas.microsoft.com/office/word/2024/wordml/sdtformatlock" xmlns:w16se="http://schemas.microsoft.com/office/word/2015/wordml/symex" xmlns:wpg="http://schemas.microsoft.com/office/word/2010/wordprocessingGroup" xmlns:wpi="http://schemas.microsoft.com/office/word/2010/wordprocessingInk" xmlns:wne="http://schemas.microsoft.com/office/word/2006/wordml" xmlns:wps="http://schemas.microsoft.com/office/word/2010/wordprocessingShape" mc:Ignorable="w14 w15 w16se w16cid w16 w16cex w16sdtdh w16sdtfl w16du wp14">
+  <w:p>
+    <w:pPr>
+      <w:pStyle w:val="Footer"/>
+    </w:pPr>
+    <w:r>
+      <w:rPr>
+        <w:noProof/>
+      </w:rPr>
+      <mc:AlternateContent>
+        <mc:Choice Requires="wps">
+          <w:drawing>
+            <wp:anchor distT="0" distB="0" distL="0" distR="0" simplePos="0" relativeHeight="251660288" behindDoc="0" locked="0" layoutInCell="1" allowOverlap="1" wp14:anchorId="1903B6B4" wp14:editId="3148273A">
+              <wp:simplePos x="914400" y="9439835"/>
+              <wp:positionH relativeFrom="page">
+                <wp:align>center</wp:align>
+              </wp:positionH>
+              <wp:positionV relativeFrom="page">
+                <wp:align>bottom</wp:align>
+              </wp:positionV>
+              <wp:extent cx="381635" cy="497205"/>
+              <wp:effectExtent l="0" t="0" r="18415" b="0"/>
+              <wp:wrapNone/>
+              <wp:docPr id="1190374795" name="Text Box 8" descr="Internal">
+                <a:extLst xmlns:a="http://schemas.openxmlformats.org/drawingml/2006/main">
+                  <a:ext uri="{5AE41FA2-C0FF-4470-9BD4-5FADCA87CBE2}">
+                    <aclsh:classification xmlns:aclsh="http://schemas.microsoft.com/office/drawing/2020/classificationShape" classificationOutcomeType="ftr"/>
+                  </a:ext>
+                </a:extLst>
+              </wp:docPr>
+              <wp:cNvGraphicFramePr/>
+              <a:graphic xmlns:a="http://schemas.openxmlformats.org/drawingml/2006/main">
+                <a:graphicData uri="http://schemas.microsoft.com/office/word/2010/wordprocessingShape">
+                  <wps:wsp>
+                    <wps:cNvSpPr txBox="1"/>
+                    <wps:spPr>
+                      <a:xfrm>
+                        <a:off x="0" y="0"/>
+                        <a:ext cx="381635" cy="497205"/>
+                      </a:xfrm>
+                      <a:prstGeom prst="rect">
+                        <a:avLst/>
+                      </a:prstGeom>
+                      <a:noFill/>
+                      <a:ln>
+                        <a:noFill/>
+                      </a:ln>
+                    </wps:spPr>
+                    <wps:txbx>
+                      <w:txbxContent>
+                        <w:p>
+                          <w:pPr>
+                            <w:spacing w:after="0"/>
+                            <w:rPr>
+                              <w:rFonts w:ascii="Arial" w:eastAsia="Arial" w:hAnsi="Arial" w:cs="Arial"/>
+                              <w:noProof/>
+                              <w:color w:val="000000"/>
+                              <w:sz w:val="18"/>
+                              <w:szCs w:val="18"/>
+                            </w:rPr>
+                          </w:pPr>
+                          <w:r>
+                            <w:rPr>
+                              <w:rFonts w:ascii="Arial" w:eastAsia="Arial" w:hAnsi="Arial" w:cs="Arial"/>
+                              <w:noProof/>
+                              <w:color w:val="000000"/>
+                              <w:sz w:val="18"/>
+                              <w:szCs w:val="18"/>
+                            </w:rPr>
+                            <w:t>Internal</w:t>
+                          </w:r>
+                        </w:p>
+                      </w:txbxContent>
+                    </wps:txbx>
+                    <wps:bodyPr rot="0" spcFirstLastPara="0" vertOverflow="overflow" horzOverflow="overflow" vert="horz" wrap="none" lIns="0" tIns="0" rIns="0" bIns="355600" numCol="1" spcCol="0" rtlCol="0" fromWordArt="0" anchor="b" anchorCtr="0" forceAA="0" compatLnSpc="1">
+                      <a:prstTxWarp prst="textNoShape">
+                        <a:avLst/>
+                      </a:prstTxWarp>
+                      <a:spAutoFit/>
+                    </wps:bodyPr>
+                  </wps:wsp>
+                </a:graphicData>
+              </a:graphic>
+              <wp14:sizeRelH relativeFrom="margin">
+                <wp14:pctWidth>0</wp14:pctWidth>
+              </wp14:sizeRelH>
+              <wp14:sizeRelV relativeFrom="margin">
+                <wp14:pctHeight>0</wp14:pctHeight>
+              </wp14:sizeRelV>
+            </wp:anchor>
+          </w:drawing>
+        </mc:Choice>
+        <mc:Fallback>
+          <w:pict>
+            <v:shapetype w14:anchorId="1903B6B4" id="_x0000_t202" coordsize="21600,21600" o:spt="202" path="m,l,21600r21600,l21600,xe">
+              <v:stroke joinstyle="miter"/>
+              <v:path gradientshapeok="t" o:connecttype="rect"/>
+            </v:shapetype>
+            <v:shape id="Text Box 8" o:spid="_x0000_s1029" type="#_x0000_t202" alt="Internal" style="position:absolute;margin-left:0;margin-top:0;width:30.05pt;height:39.15pt;z-index:251660288;visibility:visible;mso-wrap-style:none;mso-width-percent:0;mso-height-percent:0;mso-wrap-distance-left:0;mso-wrap-distance-top:0;mso-wrap-distance-right:0;mso-wrap-distance-bottom:0;mso-position-horizontal:center;mso-position-horizontal-relative:page;mso-position-vertical:bottom;mso-position-vertical-relative:page;mso-width-percent:0;mso-height-percent:0;mso-width-relative:margin;mso-height-relative:margin;v-text-anchor:bottom" o:gfxdata="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" filled="f" stroked="f">
+              <v:fill o:detectmouseclick="t"/>
+              <v:textbox style="mso-fit-shape-to-text:t" inset="0,0,0,28pt">
+                <w:txbxContent>
+                  <w:p>
+                    <w:pPr>
+                      <w:spacing w:after="0"/>
+                      <w:rPr>
+                        <w:rFonts w:ascii="Arial" w:eastAsia="Arial" w:hAnsi="Arial" w:cs="Arial"/>
+                        <w:noProof/>
+                        <w:color w:val="000000"/>
+                        <w:sz w:val="18"/>
+                        <w:szCs w:val="18"/>
+                      </w:rPr>
+                    </w:pPr>
+                    <w:r>
+                      <w:rPr>
+                        <w:rFonts w:ascii="Arial" w:eastAsia="Arial" w:hAnsi="Arial" w:cs="Arial"/>
+                        <w:noProof/>
+                        <w:color w:val="000000"/>
+                        <w:sz w:val="18"/>
+                        <w:szCs w:val="18"/>
+                      </w:rPr>
+                      <w:t>Internal</w:t>
+                    </w:r>
+                  </w:p>
+                </w:txbxContent>
+              </v:textbox>
+              <w10:wrap anchorx="page" anchory="page"/>
+            </v:shape>
+          </w:pict>
+        </mc:Fallback>
+      </mc:AlternateContent>
+    </w:r>
+  </w:p>
+</w:ftr>
+</file>
+
+<file path=word/footer3.xml><?xml version="1.0" encoding="utf-8"?>
+<w:ftr xmlns:wpc="http://schemas.microsoft.com/office/word/2010/wordprocessingCanvas" xmlns:cx="http://schemas.microsoft.com/office/drawing/2014/chartex" xmlns:cx1="http://schemas.microsoft.com/office/drawing/2015/9/8/chartex" xmlns:cx2="http://schemas.microsoft.com/office/drawing/2015/10/21/chartex" xmlns:cx3="http://schemas.microsoft.com/office/drawing/2016/5/9/chartex" xmlns:cx4="http://schemas.microsoft.com/office/drawing/2016/5/10/chartex" xmlns:cx5="http://schemas.microsoft.com/office/drawing/2016/5/11/chartex" xmlns:cx6="http://schemas.microsoft.com/office/drawing/2016/5/12/chartex" xmlns:cx7="http://schemas.microsoft.com/office/drawing/2016/5/13/chartex" xmlns:cx8="http://schemas.microsoft.com/office/drawing/2016/5/14/chartex" xmlns:mc="http://schemas.openxmlformats.org/markup-compatibility/2006" xmlns:aink="http://schemas.microsoft.com/office/drawing/2016/ink" xmlns:am3d="http://schemas.microsoft.com/office/drawing/2017/model3d" xmlns:o="urn:schemas-microsoft-com:office:office" xmlns:oel="http://schemas.microsoft.com/office/2019/extlst" xmlns:r="http://schemas.openxmlformats.org/officeDocument/2006/relationships" xmlns:m="http://schemas.openxmlformats.org/officeDocument/2006/math" xmlns:v="urn:schemas-microsoft-com:vml" xmlns:wp14="http://schemas.microsoft.com/office/word/2010/wordprocessingDrawing" xmlns:wp="http://schemas.openxmlformats.org/drawingml/2006/wordprocessingDrawing" xmlns:w10="urn:schemas-microsoft-com:office:word" xmlns:w="http://schemas.openxmlformats.org/wordprocessingml/2006/main" xmlns:w14="http://schemas.microsoft.com/office/word/2010/wordml" xmlns:w15="http://schemas.microsoft.com/office/word/2012/wordml" xmlns:w16cex="http://schemas.microsoft.com/office/word/2018/wordml/cex" xmlns:w16cid="http://schemas.microsoft.com/office/word/2016/wordml/cid" xmlns:w16="http://schemas.microsoft.com/office/word/2018/wordml" xmlns:w16du="http://schemas.microsoft.com/office/word/2023/wordml/word16du" xmlns:w16sdtdh="http://schemas.microsoft.com/office/word/2020/wordml/sdtdatahash" xmlns:w16sdtfl="http://schemas.microsoft.com/office/word/2024/wordml/sdtformatlock" xmlns:w16se="http://schemas.microsoft.com/office/word/2015/wordml/symex" xmlns:wpg="http://schemas.microsoft.com/office/word/2010/wordprocessingGroup" xmlns:wpi="http://schemas.microsoft.com/office/word/2010/wordprocessingInk" xmlns:wne="http://schemas.microsoft.com/office/word/2006/wordml" xmlns:wps="http://schemas.microsoft.com/office/word/2010/wordprocessingShape" mc:Ignorable="w14 w15 w16se w16cid w16 w16cex w16sdtdh w16sdtfl w16du wp14">
+  <w:p>
+    <w:pPr>
+      <w:pStyle w:val="Footer"/>
+    </w:pPr>
+    <w:r>
+      <w:rPr>
+        <w:noProof/>
+      </w:rPr>
+      <mc:AlternateContent>
+        <mc:Choice Requires="wps">
+          <w:drawing>
+            <wp:anchor distT="0" distB="0" distL="0" distR="0" simplePos="0" relativeHeight="251658240" behindDoc="0" locked="0" layoutInCell="1" allowOverlap="1" wp14:anchorId="003EA440" wp14:editId="2628F77A">
+              <wp:simplePos x="635" y="635"/>
+              <wp:positionH relativeFrom="page">
+                <wp:align>center</wp:align>
+              </wp:positionH>
+              <wp:positionV relativeFrom="page">
+                <wp:align>bottom</wp:align>
+              </wp:positionV>
+              <wp:extent cx="381635" cy="497205"/>
+              <wp:effectExtent l="0" t="0" r="18415" b="0"/>
+              <wp:wrapNone/>
+              <wp:docPr id="1338301378" name="Text Box 6" descr="Internal">
+                <a:extLst xmlns:a="http://schemas.openxmlformats.org/drawingml/2006/main">
+                  <a:ext uri="{5AE41FA2-C0FF-4470-9BD4-5FADCA87CBE2}">
+                    <aclsh:classification xmlns:aclsh="http://schemas.microsoft.com/office/drawing/2020/classificationShape" classificationOutcomeType="ftr"/>
+                  </a:ext>
+                </a:extLst>
+              </wp:docPr>
+              <wp:cNvGraphicFramePr/>
+              <a:graphic xmlns:a="http://schemas.openxmlformats.org/drawingml/2006/main">
+                <a:graphicData uri="http://schemas.microsoft.com/office/word/2010/wordprocessingShape">
+                  <wps:wsp>
+                    <wps:cNvSpPr txBox="1"/>
+                    <wps:spPr>
+                      <a:xfrm>
+                        <a:off x="0" y="0"/>
+                        <a:ext cx="381635" cy="497205"/>
+                      </a:xfrm>
+                      <a:prstGeom prst="rect">
+                        <a:avLst/>
+                      </a:prstGeom>
+                      <a:noFill/>
+                      <a:ln>
+                        <a:noFill/>
+                      </a:ln>
+                    </wps:spPr>
+                    <wps:txbx>
+                      <w:txbxContent>
+                        <w:p>
+                          <w:pPr>
+                            <w:spacing w:after="0"/>
+                            <w:rPr>
+                              <w:rFonts w:ascii="Arial" w:eastAsia="Arial" w:hAnsi="Arial" w:cs="Arial"/>
+                              <w:noProof/>
+                              <w:color w:val="000000"/>
+                              <w:sz w:val="18"/>
+                              <w:szCs w:val="18"/>
+                            </w:rPr>
+                          </w:pPr>
+                          <w:r>
+                            <w:rPr>
+                              <w:rFonts w:ascii="Arial" w:eastAsia="Arial" w:hAnsi="Arial" w:cs="Arial"/>
+                              <w:noProof/>
+                              <w:color w:val="000000"/>
+                              <w:sz w:val="18"/>
+                              <w:szCs w:val="18"/>
+                            </w:rPr>
+                            <w:t>Internal</w:t>
+                          </w:r>
+                        </w:p>
+                      </w:txbxContent>
+                    </wps:txbx>
+                    <wps:bodyPr rot="0" spcFirstLastPara="0" vertOverflow="overflow" horzOverflow="overflow" vert="horz" wrap="none" lIns="0" tIns="0" rIns="0" bIns="355600" numCol="1" spcCol="0" rtlCol="0" fromWordArt="0" anchor="b" anchorCtr="0" forceAA="0" compatLnSpc="1">
+                      <a:prstTxWarp prst="textNoShape">
+                        <a:avLst/>
+                      </a:prstTxWarp>
+                      <a:spAutoFit/>
+                    </wps:bodyPr>
+                  </wps:wsp>
+                </a:graphicData>
+              </a:graphic>
+              <wp14:sizeRelH relativeFrom="margin">
+                <wp14:pctWidth>0</wp14:pctWidth>
+              </wp14:sizeRelH>
+              <wp14:sizeRelV relativeFrom="margin">
+                <wp14:pctHeight>0</wp14:pctHeight>
+              </wp14:sizeRelV>
+            </wp:anchor>
+          </w:drawing>
+        </mc:Choice>
+        <mc:Fallback>
+          <w:pict>
+            <v:shapetype w14:anchorId="003EA440" id="_x0000_t202" coordsize="21600,21600" o:spt="202" path="m,l,21600r21600,l21600,xe">
+              <v:stroke joinstyle="miter"/>
+              <v:path gradientshapeok="t" o:connecttype="rect"/>
+            </v:shapetype>
+            <v:shape id="Text Box 6" o:spid="_x0000_s1030" type="#_x0000_t202" alt="Internal" style="position:absolute;margin-left:0;margin-top:0;width:30.05pt;height:39.15pt;z-index:251658240;visibility:visible;mso-wrap-style:none;mso-width-percent:0;mso-height-percent:0;mso-wrap-distance-left:0;mso-wrap-distance-top:0;mso-wrap-distance-right:0;mso-wrap-distance-bottom:0;mso-position-horizontal:center;mso-position-horizontal-relative:page;mso-position-vertical:bottom;mso-position-vertical-relative:page;mso-width-percent:0;mso-height-percent:0;mso-width-relative:margin;mso-height-relative:margin;v-text-anchor:bottom" o:gfxdata="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" filled="f" stroked="f">
+              <v:fill o:detectmouseclick="t"/>
+              <v:textbox style="mso-fit-shape-to-text:t" inset="0,0,0,28pt">
+                <w:txbxContent>
+                  <w:p>
+                    <w:pPr>
+                      <w:spacing w:after="0"/>
+                      <w:rPr>
+                        <w:rFonts w:ascii="Arial" w:eastAsia="Arial" w:hAnsi="Arial" w:cs="Arial"/>
+                        <w:noProof/>
+                        <w:color w:val="000000"/>
+                        <w:sz w:val="18"/>
+                        <w:szCs w:val="18"/>
+                      </w:rPr>
+                    </w:pPr>
+                    <w:r>
+                      <w:rPr>
+                        <w:rFonts w:ascii="Arial" w:eastAsia="Arial" w:hAnsi="Arial" w:cs="Arial"/>
+                        <w:noProof/>
+                        <w:color w:val="000000"/>
+                        <w:sz w:val="18"/>
+                        <w:szCs w:val="18"/>
+                      </w:rPr>
+                      <w:t>Internal</w:t>
+                    </w:r>
+                  </w:p>
+                </w:txbxContent>
+              </v:textbox>
+              <w10:wrap anchorx="page" anchory="page"/>
+            </v:shape>
+          </w:pict>
+        </mc:Fallback>
+      </mc:AlternateContent>
+    </w:r>
+  </w:p>
+</w:ftr>
+</file>
+
+<file path=word/footnotes.xml><?xml version="1.0" encoding="utf-8"?>
+<w:footnotes xmlns:wpc="http://schemas.microsoft.com/office/word/2010/wordprocessingCanvas" xmlns:cx="http://schemas.microsoft.com/office/drawing/2014/chartex" xmlns:cx1="http://schemas.microsoft.com/office/drawing/2015/9/8/chartex" xmlns:cx2="http://schemas.microsoft.com/office/drawing/2015/10/21/chartex" xmlns:cx3="http://schemas.microsoft.com/office/drawing/2016/5/9/chartex" xmlns:cx4="http://schemas.microsoft.com/office/drawing/2016/5/10/chartex" xmlns:cx5="http://schemas.microsoft.com/office/drawing/2016/5/11/chartex" xmlns:cx6="http://schemas.microsoft.com/office/drawing/2016/5/12/chartex" xmlns:cx7="http://schemas.microsoft.com/office/drawing/2016/5/13/chartex" xmlns:cx8="http://schemas.microsoft.com/office/drawing/2016/5/14/chartex" xmlns:mc="http://schemas.openxmlformats.org/markup-compatibility/2006" xmlns:aink="http://schemas.microsoft.com/office/drawing/2016/ink" xmlns:am3d="http://schemas.microsoft.com/office/drawing/2017/model3d" xmlns:o="urn:schemas-microsoft-com:office:office" xmlns:oel="http://schemas.microsoft.com/office/2019/extlst" xmlns:r="http://schemas.openxmlformats.org/officeDocument/2006/relationships" xmlns:m="http://schemas.openxmlformats.org/officeDocument/2006/math" xmlns:v="urn:schemas-microsoft-com:vml" xmlns:wp14="http://schemas.microsoft.com/office/word/2010/wordprocessingDrawing" xmlns:wp="http://schemas.openxmlformats.org/drawingml/2006/wordprocessingDrawing" xmlns:w10="urn:schemas-microsoft-com:office:word" xmlns:w="http://schemas.openxmlformats.org/wordprocessingml/2006/main" xmlns:w14="http://schemas.microsoft.com/office/word/2010/wordml" xmlns:w15="http://schemas.microsoft.com/office/word/2012/wordml" xmlns:w16cex="http://schemas.microsoft.com/office/word/2018/wordml/cex" xmlns:w16cid="http://schemas.microsoft.com/office/word/2016/wordml/cid" xmlns:w16="http://schemas.microsoft.com/office/word/2018/wordml" xmlns:w16du="http://schemas.microsoft.com/office/word/2023/wordml/word16du" xmlns:w16sdtdh="http://schemas.microsoft.com/office/word/2020/wordml/sdtdatahash" xmlns:w16sdtfl="http://schemas.microsoft.com/office/word/2024/wordml/sdtformatlock" xmlns:w16se="http://schemas.microsoft.com/office/word/2015/wordml/symex" xmlns:wpg="http://schemas.microsoft.com/office/word/2010/wordprocessingGroup" xmlns:wpi="http://schemas.microsoft.com/office/word/2010/wordprocessingInk" xmlns:wne="http://schemas.microsoft.com/office/word/2006/wordml" xmlns:wps="http://schemas.microsoft.com/office/word/2010/wordprocessingShape" mc:Ignorable="w14 w15 w16se w16cid w16 w16cex w16sdtdh w16sdtfl w16du wp14">
+  <w:footnote w:type="separator" w:id="-1">
+    <w:p>
+      <w:pPr>
+        <w:spacing w:after="0" w:line="240" w:lineRule="auto"/>
+      </w:pPr>
+      <w:r>
+        <w:separator/>
+      </w:r>
+    </w:p>
+  </w:footnote>
+  <w:footnote w:type="continuationSeparator" w:id="0">
+    <w:p>
+      <w:pPr>
+        <w:spacing w:after="0" w:line="240" w:lineRule="auto"/>
+      </w:pPr>
+      <w:r>
+        <w:continuationSeparator/>
+      </w:r>
+    </w:p>
+  </w:footnote>
+</w:footnotes>
+</file>
+
 <file path=word/styles.xml><?xml version="1.0" encoding="utf-8"?>
-<w:styles xmlns:mc="http://schemas.openxmlformats.org/markup-compatibility/2006" xmlns:r="http://schemas.openxmlformats.org/officeDocument/2006/relationships" xmlns:w="http://schemas.openxmlformats.org/wordprocessingml/2006/main" xmlns:w14="http://schemas.microsoft.com/office/word/2010/wordml" xmlns:w15="http://schemas.microsoft.com/office/word/2012/wordml" xmlns:w16cex="http://schemas.microsoft.com/office/word/2018/wordml/cex" xmlns:w16cid="http://schemas.microsoft.com/office/word/2016/wordml/cid" xmlns:w16="http://schemas.microsoft.com/office/word/2018/wordml" xmlns:w16sdtdh="http://schemas.microsoft.com/office/word/2020/wordml/sdtdatahash" xmlns:w16se="http://schemas.microsoft.com/office/word/2015/wordml/symex" mc:Ignorable="w14 w15 w16se w16cid w16 w16cex w16sdtdh">
+<w:styles xmlns:mc="http://schemas.openxmlformats.org/markup-compatibility/2006" xmlns:r="http://schemas.openxmlformats.org/officeDocument/2006/relationships" xmlns:w="http://schemas.openxmlformats.org/wordprocessingml/2006/main" xmlns:w14="http://schemas.microsoft.com/office/word/2010/wordml" xmlns:w15="http://schemas.microsoft.com/office/word/2012/wordml" xmlns:w16cex="http://schemas.microsoft.com/office/word/2018/wordml/cex" xmlns:w16cid="http://schemas.microsoft.com/office/word/2016/wordml/cid" xmlns:w16="http://schemas.microsoft.com/office/word/2018/wordml" xmlns:w16du="http://schemas.microsoft.com/office/word/2023/wordml/word16du" xmlns:w16sdtdh="http://schemas.microsoft.com/office/word/2020/wordml/sdtdatahash" xmlns:w16sdtfl="http://schemas.microsoft.com/office/word/2024/wordml/sdtformatlock" xmlns:w16se="http://schemas.microsoft.com/office/word/2015/wordml/symex" mc:Ignorable="w14 w15 w16se w16cid w16 w16cex w16sdtdh w16sdtfl w16du">
   <w:docDefaults>
     <w:rPrDefault>
       <w:rPr>
@@ -1363,6 +1733,28 @@
     <w:basedOn w:val="DefaultParagraphFont"/>
     <w:rsid w:val="00724580"/>
   </w:style>
+  <w:style w:type="paragraph" w:styleId="Footer">
+    <w:name w:val="footer"/>
+    <w:basedOn w:val="Normal"/>
+    <w:link w:val="FooterChar"/>
+    <w:uiPriority w:val="99"/>
+    <w:unhideWhenUsed/>
+    <w:rsid w:val="00160267"/>
+    <w:pPr>
+      <w:tabs>
+        <w:tab w:val="center" w:pos="4680"/>
+        <w:tab w:val="right" w:pos="9360"/>
+      </w:tabs>
+      <w:spacing w:after="0" w:line="240" w:lineRule="auto"/>
+    </w:pPr>
+  </w:style>
+  <w:style w:type="character" w:customStyle="1" w:styleId="FooterChar">
+    <w:name w:val="Footer Char"/>
+    <w:basedOn w:val="DefaultParagraphFont"/>
+    <w:link w:val="Footer"/>
+    <w:uiPriority w:val="99"/>
+    <w:rsid w:val="00160267"/>
+  </w:style>
 </w:styles>
 </file>
 
@@ -1659,4 +2051,10 @@
     </a:ext>
   </a:extLst>
 </a:theme>
+</file>
+
+<file path=docMetadata/LabelInfo.xml><?xml version="1.0" encoding="utf-8"?>
+<clbl:labelList xmlns:clbl="http://schemas.microsoft.com/office/2020/mipLabelMetadata">
+  <clbl:label id="{4af293e6-3850-4258-b2c7-0aa0e3bfa7d9}" enabled="1" method="Privileged" siteId="{b9fec68c-c92d-461e-9a97-3d03a0f18b82}" contentBits="3" removed="0"/>
+</clbl:labelList>
 </file>
</xml_diff>